<commit_message>
Proposal: variables versus days stated as measured, request and cast totals from their own counts, the glider result scoped to its deployment, INCOIS tool gaps worded as checked, IMD Amphan report cited
</commit_message>
<xml_diff>
--- a/submission/sih/final/VVater-SIH2026-proposal.docx
+++ b/submission/sih/final/VVater-SIH2026-proposal.docx
@@ -271,7 +271,7 @@
           <w:i w:val="0"/>
           <w:sz w:val="22"/>
         </w:rPr>
-        <w:t>VVater is a browser-native 3D ocean platform for INCOIS. A user picks a box anywhere on Earth, a day from 1993 to the forecast horizon and one of 23 model variables, and the model's own depth levels are lifted out as a block that can be cut open and seen from the side. Argo floats stand inside it, each with its QC flag, data mode and source file, and one click compares a float with the model on its own day. Data is read where Copernicus and INCOIS publish it, so there is no archive to build. It is built and measured: against an independent glider, the INCOIS analysis is within 0.31 °C below 300 m but off by 2.89 °C in the upper 300 m, the layer cyclones feed on: hidden in a pooled number, plain in 3D. It serves forecasters, fishermen, students and the public.</w:t>
+        <w:t>VVater is a browser-native 3D ocean platform for INCOIS. A user picks a box anywhere on Earth, a day and one of 23 model variables (17 of them daily since 1993, all to the forecast horizon), and the model's own depth levels are lifted out as a block that can be cut open and seen from the side. Argo floats stand inside it, each with its QC flag, data mode and source file, and one click compares a float with the model on its own day. Data is read where Copernicus and INCOIS publish it: no archive to build. It is built and measured: against an independent glider, the INCOIS analysis has 0.31 °C RMSE below 300 m but 2.89 °C in the upper 300 m, the layer cyclones feed on: hidden in a pooled number, plain in 3D. It serves forecasters, fishermen, students and the public.</w:t>
       </w:r>
     </w:p>
     <w:p>
@@ -358,7 +358,7 @@
           <w:i w:val="0"/>
           <w:sz w:val="22"/>
         </w:rPr>
-        <w:t>What we found building it, each measured by our evaluation harness:</w:t>
+        <w:t>What we found building it (the first three are evaluation-harness results, the last a probe of the links):</w:t>
       </w:r>
     </w:p>
     <w:p>
@@ -433,7 +433,7 @@
         <w:rPr>
           <w:sz w:val="22"/>
         </w:rPr>
-        <w:t>Against the assimilated Argo floats the analysis looks close (0.71 °C RMSE); against an independent glider it is 1.58 °C, and banding by depth puts almost all of that in the upper 300 m (2.89 °C).</w:t>
+        <w:t>Against the assimilated Argo floats the analysis looks close (0.71 °C RMSE); against an independent glider it is 1.58 °C, and banding by depth puts almost all of that in the upper 300 m (2.89 °C RMSE, bias -2.25 °C). One glider deployment (ru29), one fortnight off Sri Lanka in 2018: a finding about that water, not about the analysis everywhere.</w:t>
       </w:r>
     </w:p>
     <w:p>
@@ -809,7 +809,7 @@
                 <w:b w:val="0"/>
                 <w:sz w:val="20"/>
               </w:rPr>
-              <w:t>The address given at launch (do.incois.gov.in) did not resolve from our network on 2026-09-26, so we could not assess it first-hand. The announcement does not describe model–float co-location, QC-flag display, or cutting a volume open.</w:t>
+              <w:t>The address given at launch (do.incois.gov.in) did not resolve from our network on 2026-09-26, so we could not assess it first-hand. The announcement does not describe model–float co-location or QC-flag display, and the 2026 problem statement still finds that no integrated 3D platform for model fields and in-situ observations exists.</w:t>
             </w:r>
           </w:p>
         </w:tc>
@@ -910,7 +910,7 @@
                 <w:b w:val="0"/>
                 <w:sz w:val="20"/>
               </w:rPr>
-              <w:t>Static 2D plots one request at a time; no interactive 3D volume; instrument profiles are not drawn in the same view as the model.</w:t>
+              <w:t>Static 2D plots one request at a time; no interactive 3D volume; drawing instrument profiles in the same view as the model is not found in its documentation.</w:t>
             </w:r>
           </w:p>
         </w:tc>
@@ -1011,7 +1011,7 @@
                 <w:b w:val="0"/>
                 <w:sz w:val="20"/>
               </w:rPr>
-              <w:t>A data service, not a viewer: graphs are 2D, and the error field is never drawn.</w:t>
+              <w:t>A data service, not a viewer: graphs are 2D, one variable at a time, so the error field is a separate plot, never combined with the field it qualifies; no 3D view.</w:t>
             </w:r>
           </w:p>
         </w:tc>
@@ -1112,7 +1112,7 @@
                 <w:b w:val="0"/>
                 <w:sz w:val="20"/>
               </w:rPr>
-              <w:t>Product downloads and galleries; no interactive 3D view and no Argo or glider overlay on the portal.</w:t>
+              <w:t>Product downloads and galleries; an interactive 3D view or an Argo or glider overlay was not found on the portal.</w:t>
             </w:r>
           </w:p>
         </w:tc>
@@ -1891,7 +1891,7 @@
           <w:i w:val="0"/>
           <w:sz w:val="22"/>
         </w:rPr>
-        <w:t>Build a cube generator that serves any box, any day and any of the catalogue's 23 variables on the model's native depth levels only, and opens a prepared cube in under a second. Done: 0.08 s for the Amphan cube from the disk cache, 1.15 MB to the browser.</w:t>
+        <w:t>Build a cube generator that serves any box, any day in each variable's coverage and any of the catalogue's 23 variables (17 of them from 1993) on the model's native depth levels only, and opens a prepared cube in under a second. Done: 0.08 s for the Amphan cube from the disk cache, 1.15 MB to the browser.</w:t>
       </w:r>
     </w:p>
     <w:p>
@@ -1951,7 +1951,7 @@
           <w:i w:val="0"/>
           <w:sz w:val="22"/>
         </w:rPr>
-        <w:t>By the end of the grand finale, close the four known gaps in section 5.1 and put the platform in front of INCOIS forecasters, recording what they could and could not do unassisted. In progress.</w:t>
+        <w:t>By the end of the grand finale, close the known gaps scheduled in section 5.1 and put the platform in front of INCOIS forecasters, recording what they could and could not do unassisted. In progress.</w:t>
       </w:r>
     </w:p>
     <w:p>
@@ -2172,7 +2172,7 @@
           <w:i w:val="0"/>
           <w:sz w:val="22"/>
         </w:rPr>
-        <w:t>510 of 11,525 Argo levels fail QC and all are shown as rejected; 6 impossible model cells are masked and counted; the text and NetCDF parsers agree on 24,611 of 24,611 levels.</w:t>
+        <w:t>510 of 11,525 Argo levels fail QC and all are shown as rejected; 6 impossible model cells are masked and counted; the text and NetCDF parsers give identical casts, 222 of 222 (24,611 levels).</w:t>
       </w:r>
     </w:p>
     <w:p>
@@ -2534,7 +2534,7 @@
           <w:i/>
           <w:sz w:val="18"/>
         </w:rPr>
-        <w:t>Figure 3. RMSE of the INCOIS analysis by depth band: Argo (grey, assimilated) and the independent glider (blue). Below 300 m they agree; the error is in the upper 300 m.</w:t>
+        <w:t>Figure 3. RMSE of the INCOIS analysis by depth band: Argo (grey, assimilated) and the independent glider (blue). Below 300 m they agree; the error is in the upper 300 m. One glider deployment, so a finding about that water.</w:t>
       </w:r>
     </w:p>
     <w:p>
@@ -3035,7 +3035,7 @@
                 <w:b w:val="0"/>
                 <w:sz w:val="20"/>
               </w:rPr>
-              <w:t>CF Conventions (read defensively, every assumption recorded), OGC WMS 1.3.0, REST/JSON, Argo QC flags, IOOS QARTOD</w:t>
+              <w:t>CF Conventions (read defensively, every assumption recorded), OGC WMS 1.3.0, REST/JSON, Argo QC flags; IOOS QARTOD flags read where present (else carried as unevaluated)</w:t>
             </w:r>
           </w:p>
         </w:tc>
@@ -6733,6 +6733,26 @@
           <w:sz w:val="20"/>
         </w:rPr>
         <w:t xml:space="preserve">22. </w:t>
+      </w:r>
+      <w:r>
+        <w:rPr>
+          <w:b w:val="0"/>
+          <w:i w:val="0"/>
+          <w:sz w:val="20"/>
+        </w:rPr>
+        <w:t>India Meteorological Department, report on Super Cyclonic Storm Amphan (2020). The Amphan dates.</w:t>
+      </w:r>
+    </w:p>
+    <w:p>
+      <w:pPr>
+        <w:spacing w:after="120"/>
+      </w:pPr>
+      <w:r>
+        <w:rPr>
+          <w:b/>
+          <w:sz w:val="20"/>
+        </w:rPr>
+        <w:t xml:space="preserve">23. </w:t>
       </w:r>
       <w:r>
         <w:rPr>

</xml_diff>